<commit_message>
Add appendix 2 to build, blurb desc, regen book outputs
</commit_message>
<xml_diff>
--- a/papers/viking-poets/viking-poets.docx
+++ b/papers/viking-poets/viking-poets.docx
@@ -7290,6 +7290,14 @@
         <w:pStyle w:val="BodyText"/>
       </w:pPr>
       <w:r>
+        <w:t xml:space="preserve">Return, then, to where we started. The large language model of 2026 is a magnificent brain in a jar: it has read more than any human ever could, it produces fluent and confident prose on any subject, and when its lossy memory reconstructs something that was never there, it has no way to know. It cannot feel the burn of the stove, cannot open the drawer to check the original, cannot hear the meter break, cannot be corrected by a colleague who was there, cannot notice its own certainty running ahead of its evidence. It is the unlucky bard of Chapter 3, master of the surface and blind to the difference between its true lines and its fabricated ones. That is not a failure of intelligence; the brain in the jar is extraordinary. It is a failure of architecture, the five missing walls of a house built as a single door. The industry’s answer has been to make the brain larger, as though a big enough seed could become a tree without soil. The answer of every civilization that ever kept knowledge alive across a hostile, forgetful, adversarial world was the opposite: leave the brain roughly as it is, and build the other five layers around it. The skalds did it in verse, the Masoretes in counted letters, the Brahmins in a hundred interlocking voices. The task in front of us is to do it in silicon.</w:t>
+      </w:r>
+    </w:p>
+    <w:p>
+      <w:pPr>
+        <w:pStyle w:val="BodyText"/>
+      </w:pPr>
+      <w:r>
         <w:t xml:space="preserve">The question isn’t how to build a bigger brain. It’s how to give it a door to go back and check, a body, a notebook, and colleagues who will tell it when it’s wrong.</w:t>
       </w:r>
     </w:p>
@@ -8530,6 +8538,562 @@
         <w:pict>
           <v:rect style="width:0;height:1.5pt" o:hralign="center" o:hrstd="t" o:hr="t"/>
         </w:pict>
+      </w:r>
+    </w:p>
+    <w:p>
+      <w:pPr>
+        <w:pStyle w:val="BlockText"/>
+      </w:pPr>
+      <w:r>
+        <w:rPr>
+          <w:i/>
+          <w:iCs/>
+        </w:rPr>
+        <w:t xml:space="preserve">This is what works for humans. Let us find the analogs for the machine.</w:t>
+      </w:r>
+    </w:p>
+    <w:p>
+      <w:r>
+        <w:pict>
+          <v:rect style="width:0;height:1.5pt" o:hralign="center" o:hrstd="t" o:hr="t"/>
+        </w:pict>
+      </w:r>
+    </w:p>
+    <w:p>
+      <w:pPr>
+        <w:pStyle w:val="FirstParagraph"/>
+      </w:pPr>
+      <w:r>
+        <w:t xml:space="preserve">Everything to this point has argued from the human side: here is a layer, here is the class of error it catches, here is the tradition that discovered it. This appendix does the translation the argument has been pointing at the whole time. It is deliberately a sketch and not a blueprint. The claim is not that ancient wisdom will magically repair a language model, and nothing here depends on the poetry being sacred, inspired, or anything but well engineered. The claim is narrower and, I think, harder to argue with: reliable intelligence has always required these six layers, none of them is exotic to build in silicon, and several are already being built by people who arrived at them independently. What follows takes the stack of the conclusion, layer by layer, and names the machine analog of each.</w:t>
+      </w:r>
+    </w:p>
+    <w:p>
+      <w:pPr>
+        <w:pStyle w:val="BodyText"/>
+      </w:pPr>
+      <w:r>
+        <w:t xml:space="preserve">One framing makes the whole translation easier, and it is worth stating plainly because it also disarms the objection that this book is mysticism in a lab coat. The thesis is not</w:t>
+      </w:r>
+      <w:r>
+        <w:t xml:space="preserve"> </w:t>
+      </w:r>
+      <w:r>
+        <w:rPr>
+          <w:i/>
+          <w:iCs/>
+        </w:rPr>
+        <w:t xml:space="preserve">ancient methods are superior to modern engineering.</w:t>
+      </w:r>
+      <w:r>
+        <w:t xml:space="preserve"> </w:t>
+      </w:r>
+      <w:r>
+        <w:t xml:space="preserve">It is</w:t>
+      </w:r>
+      <w:r>
+        <w:t xml:space="preserve"> </w:t>
+      </w:r>
+      <w:r>
+        <w:rPr>
+          <w:i/>
+          <w:iCs/>
+        </w:rPr>
+        <w:t xml:space="preserve">these are the methods that have kept intelligence honest under noisy, lossy, adversarial conditions for three thousand years, so they are the first place to look for what a language model is missing.</w:t>
+      </w:r>
+      <w:r>
+        <w:t xml:space="preserve"> </w:t>
+      </w:r>
+      <w:r>
+        <w:t xml:space="preserve">That is the same move that gave us neural networks from neurons and attention from the spotlight of human focus. Bio-inspiration, not incantation.</w:t>
+      </w:r>
+    </w:p>
+    <w:p>
+      <w:r>
+        <w:pict>
+          <v:rect style="width:0;height:1.5pt" o:hralign="center" o:hrstd="t" o:hr="t"/>
+        </w:pict>
+      </w:r>
+    </w:p>
+    <w:p>
+      <w:pPr>
+        <w:pStyle w:val="FirstParagraph"/>
+      </w:pPr>
+      <w:r>
+        <w:rPr>
+          <w:b/>
+          <w:bCs/>
+        </w:rPr>
+        <w:t xml:space="preserve">Layer 0, deterministic delegation.</w:t>
+      </w:r>
+      <w:r>
+        <w:t xml:space="preserve"> </w:t>
+      </w:r>
+      <w:r>
+        <w:t xml:space="preserve">The human offloads computation to a tool that cannot get it wrong: the stop block, the jig, the calculator. This is the layer closest to done. Tool use, code interpreters, and function calling already let a model hand arithmetic and logic to hardware that is incapable of the probabilistic drift of Chapter 1. What is still largely missing is not the tools but the</w:t>
+      </w:r>
+      <w:r>
+        <w:t xml:space="preserve"> </w:t>
+      </w:r>
+      <w:r>
+        <w:rPr>
+          <w:i/>
+          <w:iCs/>
+        </w:rPr>
+        <w:t xml:space="preserve">discipline</w:t>
+      </w:r>
+      <w:r>
+        <w:t xml:space="preserve"> </w:t>
+      </w:r>
+      <w:r>
+        <w:t xml:space="preserve">of using them: a reliable sense of when to compute and when it is safe to pattern-match, and the reflex to trust the deterministic result over the model’s own confident guess, every time. That reflex is a metacognitive routing problem, and it reappears at Layer 5. Build the router and this layer is finished.</w:t>
+      </w:r>
+    </w:p>
+    <w:p>
+      <w:pPr>
+        <w:pStyle w:val="BodyText"/>
+      </w:pPr>
+      <w:r>
+        <w:rPr>
+          <w:b/>
+          <w:bCs/>
+        </w:rPr>
+        <w:t xml:space="preserve">Layer 1, embodied grounding.</w:t>
+      </w:r>
+      <w:r>
+        <w:t xml:space="preserve"> </w:t>
+      </w:r>
+      <w:r>
+        <w:t xml:space="preserve">The human has an independent channel to reality that does not pass through anyone else’s words: the thermometer, the burn, the table saw that does not care about your intentions. Full robotic embodiment is hard and will stay hard. But the load-bearing property is not the robot arm; it is the</w:t>
+      </w:r>
+      <w:r>
+        <w:t xml:space="preserve"> </w:t>
+      </w:r>
+      <w:r>
+        <w:rPr>
+          <w:i/>
+          <w:iCs/>
+        </w:rPr>
+        <w:t xml:space="preserve">independent channel that can contradict the weights.</w:t>
+      </w:r>
+      <w:r>
+        <w:t xml:space="preserve"> </w:t>
+      </w:r>
+      <w:r>
+        <w:t xml:space="preserve">A model has weak sensors already whenever it can run an executable check, query a ground-truth instrument, or be corrected by a human who was there. The design principle is to preserve at least one channel of information that the training process did not author, and to let that channel win. This is what makes reality the final referee, a role it will keep in every layer below.</w:t>
+      </w:r>
+    </w:p>
+    <w:p>
+      <w:pPr>
+        <w:pStyle w:val="BodyText"/>
+      </w:pPr>
+      <w:r>
+        <w:rPr>
+          <w:b/>
+          <w:bCs/>
+        </w:rPr>
+        <w:t xml:space="preserve">Layer 2, pervasive memory with attribution.</w:t>
+      </w:r>
+      <w:r>
+        <w:t xml:space="preserve"> </w:t>
+      </w:r>
+      <w:r>
+        <w:t xml:space="preserve">The human writes it down, and the serious traditions write down</w:t>
+      </w:r>
+      <w:r>
+        <w:t xml:space="preserve"> </w:t>
+      </w:r>
+      <w:r>
+        <w:rPr>
+          <w:i/>
+          <w:iCs/>
+        </w:rPr>
+        <w:t xml:space="preserve">who said it and when.</w:t>
+      </w:r>
+      <w:r>
+        <w:t xml:space="preserve"> </w:t>
+      </w:r>
+      <w:r>
+        <w:t xml:space="preserve">This is the largest lift and the most important, and it has several parts that the field tends to attempt separately when they need to be one system.</w:t>
+      </w:r>
+    </w:p>
+    <w:p>
+      <w:pPr>
+        <w:pStyle w:val="BodyText"/>
+      </w:pPr>
+      <w:r>
+        <w:t xml:space="preserve">First, the memory must be updatable in real time. A frozen-weights model is a scholar who has burned the library and kept only what he remembers; corrective retraining that overwrites the previous state, as Chapter 2 argued, cannot audit its own history of corrections. What is needed is a live store the system reads from and writes to continuously, with snapshots for rollback so that a bad update can be reverted to a known-good state rather than silently propagating forward.</w:t>
+      </w:r>
+    </w:p>
+    <w:p>
+      <w:pPr>
+        <w:pStyle w:val="BodyText"/>
+      </w:pPr>
+      <w:r>
+        <w:t xml:space="preserve">Second, the system should keep a full, append-only log of its inputs, the way the Vedic</w:t>
+      </w:r>
+      <w:r>
+        <w:t xml:space="preserve"> </w:t>
+      </w:r>
+      <w:r>
+        <w:rPr>
+          <w:i/>
+          <w:iCs/>
+        </w:rPr>
+        <w:t xml:space="preserve">samhita</w:t>
+      </w:r>
+      <w:r>
+        <w:t xml:space="preserve"> </w:t>
+      </w:r>
+      <w:r>
+        <w:t xml:space="preserve">text or Karpathy’s immutable</w:t>
+      </w:r>
+      <w:r>
+        <w:t xml:space="preserve"> </w:t>
+      </w:r>
+      <w:r>
+        <w:rPr>
+          <w:rStyle w:val="VerbatimChar"/>
+        </w:rPr>
+        <w:t xml:space="preserve">raw/</w:t>
+      </w:r>
+      <w:r>
+        <w:t xml:space="preserve"> </w:t>
+      </w:r>
+      <w:r>
+        <w:t xml:space="preserve">folder does, and then run a periodic consolidation pass that promotes the durable, load-bearing details into long-term memory and lets the rest of the log age out once the store fills. This is not a metaphor for a future system. OpenClaw, an open-source agent runtime that appeared in early 2026, only months after this book was first drafted, keeps exactly this shape: an append-only session log, a curated long-term memory file, a</w:t>
+      </w:r>
+      <w:r>
+        <w:t xml:space="preserve"> </w:t>
+      </w:r>
+      <w:r>
+        <w:t xml:space="preserve">“memory flush”</w:t>
+      </w:r>
+      <w:r>
+        <w:t xml:space="preserve"> </w:t>
+      </w:r>
+      <w:r>
+        <w:t xml:space="preserve">that saves important context before the window is compacted so that compression does not silently destroy it, and an optional background</w:t>
+      </w:r>
+      <w:r>
+        <w:t xml:space="preserve"> </w:t>
+      </w:r>
+      <w:r>
+        <w:t xml:space="preserve">“dreaming”</w:t>
+      </w:r>
+      <w:r>
+        <w:t xml:space="preserve"> </w:t>
+      </w:r>
+      <w:r>
+        <w:t xml:space="preserve">pass that scores recent material and promotes only the qualified items into durable storage. That last mechanism is the sleep-consolidation of Chapter 2 implemented as a cron job. Together with Karpathy’s compiled wiki and Jovovich’s MemPalace from the Introduction, it is a third independent reinvention of the notebook layer inside a single year.</w:t>
+      </w:r>
+    </w:p>
+    <w:p>
+      <w:pPr>
+        <w:pStyle w:val="BodyText"/>
+      </w:pPr>
+      <w:r>
+        <w:t xml:space="preserve">Third, every stored item must carry its provenance: source, timestamp, and a confidence. This is the</w:t>
+      </w:r>
+      <w:r>
+        <w:t xml:space="preserve"> </w:t>
+      </w:r>
+      <w:r>
+        <w:rPr>
+          <w:i/>
+          <w:iCs/>
+        </w:rPr>
+        <w:t xml:space="preserve">isnad</w:t>
+      </w:r>
+      <w:r>
+        <w:t xml:space="preserve"> </w:t>
+      </w:r>
+      <w:r>
+        <w:t xml:space="preserve">of Chapter 5 rendered as metadata, and it is what lets a later reader weight a claim, detect a biased source, and notice that the author at sixty is a different witness from the author at thirty.</w:t>
+      </w:r>
+    </w:p>
+    <w:p>
+      <w:pPr>
+        <w:pStyle w:val="BodyText"/>
+      </w:pPr>
+      <w:r>
+        <w:t xml:space="preserve">There is a subtler question hiding inside this layer, and it is the one Chapter 1 raised through Crabtree and the songlines:</w:t>
+      </w:r>
+      <w:r>
+        <w:t xml:space="preserve"> </w:t>
+      </w:r>
+      <w:r>
+        <w:rPr>
+          <w:i/>
+          <w:iCs/>
+        </w:rPr>
+        <w:t xml:space="preserve">what gets written down in the first place?</w:t>
+      </w:r>
+      <w:r>
+        <w:t xml:space="preserve"> </w:t>
+      </w:r>
+      <w:r>
+        <w:t xml:space="preserve">A log that keeps everything equally is a log no one can consolidate. The human answer is that some experiences arrive already flagged as worth storing, and they are flagged by a felt event, surprise, the collision of two expectations, the yoking of two domains that do not usually meet. This is exactly why a kenning is memorable and a paraphrase of it is not:</w:t>
+      </w:r>
+      <w:r>
+        <w:t xml:space="preserve"> </w:t>
+      </w:r>
+      <w:r>
+        <w:t xml:space="preserve">“whale-road”</w:t>
+      </w:r>
+      <w:r>
+        <w:t xml:space="preserve"> </w:t>
+      </w:r>
+      <w:r>
+        <w:t xml:space="preserve">forces two unlike fields into apposition, and the small shock of that junction is the thing that marks it for storage. A language model has a native analog of that shock. It is prediction error, the divergence between what the model expected and what actually arrived, and the contradiction between two sources that should agree. A memory system whose write policy is driven by those signals, storing most heavily where the model was most surprised or most contradicted, is implementing the human salience mechanism rather than the naive one of storing by recency or by keyword. The notable is what does not fit, and what does not fit is what is worth keeping with its context intact.</w:t>
+      </w:r>
+    </w:p>
+    <w:p>
+      <w:pPr>
+        <w:pStyle w:val="BodyText"/>
+      </w:pPr>
+      <w:r>
+        <w:rPr>
+          <w:b/>
+          <w:bCs/>
+        </w:rPr>
+        <w:t xml:space="preserve">Layer 3, structural encoding.</w:t>
+      </w:r>
+      <w:r>
+        <w:t xml:space="preserve"> </w:t>
+      </w:r>
+      <w:r>
+        <w:t xml:space="preserve">The human protects knowledge with multiple independent channels, meter and rhyme and kenning and chiasm, so that damage to one shows up against the others. The tempting translation is the shallow one, and it is worth naming so it can be set aside: force the model to generate in rhyme or in kenning-like compounds and measure whether it hallucinates less. That literalizes the surface and misses the mechanism. The real translation is</w:t>
+      </w:r>
+      <w:r>
+        <w:t xml:space="preserve"> </w:t>
+      </w:r>
+      <w:r>
+        <w:rPr>
+          <w:i/>
+          <w:iCs/>
+        </w:rPr>
+        <w:t xml:space="preserve">redundant representation</w:t>
+      </w:r>
+      <w:r>
+        <w:t xml:space="preserve">: store each claim together with independent encodings of the same content, its provenance, its logical dependencies, its numerical or physical constraints, so that a corruption in one representation is caught by its disagreement with the others. This is the semantic checksum of Chapter 4, and it is the same principle as a Reed-Solomon code, not a poetry-generation exercise. Chapter 1’s second point about encoding belongs here too: the store should preserve the retrieval-state cue, the context and framing under which a thing was learned, so that priming can reach it again, the way a melody reopens the words it once carried.</w:t>
+      </w:r>
+    </w:p>
+    <w:p>
+      <w:pPr>
+        <w:pStyle w:val="BodyText"/>
+      </w:pPr>
+      <w:r>
+        <w:rPr>
+          <w:b/>
+          <w:bCs/>
+        </w:rPr>
+        <w:t xml:space="preserve">Layer 4, adversarial verification, and debugging the reasoning chain.</w:t>
+      </w:r>
+      <w:r>
+        <w:t xml:space="preserve"> </w:t>
+      </w:r>
+      <w:r>
+        <w:t xml:space="preserve">The human answer to deliberate corruption is a community that disagrees, cross-checks, and audits provenance. The machine analog is multi-agent verification, with, again, humans and reality as the court of last appeal when the agents cannot settle it among themselves. But there is a refinement here that the standard</w:t>
+      </w:r>
+      <w:r>
+        <w:t xml:space="preserve"> </w:t>
+      </w:r>
+      <w:r>
+        <w:t xml:space="preserve">“let the models debate and vote”</w:t>
+      </w:r>
+      <w:r>
+        <w:t xml:space="preserve"> </w:t>
+      </w:r>
+      <w:r>
+        <w:t xml:space="preserve">framing misses, and it is the most distinctively human-tradition part of the whole appendix. In the rabbinic argument over</w:t>
+      </w:r>
+      <w:r>
+        <w:t xml:space="preserve"> </w:t>
+      </w:r>
+      <w:r>
+        <w:rPr>
+          <w:i/>
+          <w:iCs/>
+        </w:rPr>
+        <w:t xml:space="preserve">halakhah</w:t>
+      </w:r>
+      <w:r>
+        <w:t xml:space="preserve">, a correct conclusion reached by invalid reasoning is not accepted; the derivation is audited step by step, and a broken step invalidates the result even when the result happens to be right. The lesson for machine verification is that checking the</w:t>
+      </w:r>
+      <w:r>
+        <w:t xml:space="preserve"> </w:t>
+      </w:r>
+      <w:r>
+        <w:rPr>
+          <w:i/>
+          <w:iCs/>
+        </w:rPr>
+        <w:t xml:space="preserve">answer</w:t>
+      </w:r>
+      <w:r>
+        <w:t xml:space="preserve"> </w:t>
+      </w:r>
+      <w:r>
+        <w:t xml:space="preserve">is not enough. You must debug the</w:t>
+      </w:r>
+      <w:r>
+        <w:t xml:space="preserve"> </w:t>
+      </w:r>
+      <w:r>
+        <w:rPr>
+          <w:i/>
+          <w:iCs/>
+        </w:rPr>
+        <w:t xml:space="preserve">reasoning chain</w:t>
+      </w:r>
+      <w:r>
+        <w:t xml:space="preserve">, because an answer that is right for the wrong reason will be wrong the next time the reasons matter, and a system that is only ever graded on outcomes learns to produce right-looking outcomes rather than valid derivations. Process verification, not outcome verification, is what the</w:t>
+      </w:r>
+      <w:r>
+        <w:t xml:space="preserve"> </w:t>
+      </w:r>
+      <w:r>
+        <w:rPr>
+          <w:i/>
+          <w:iCs/>
+        </w:rPr>
+        <w:t xml:space="preserve">isnad</w:t>
+      </w:r>
+      <w:r>
+        <w:t xml:space="preserve"> </w:t>
+      </w:r>
+      <w:r>
+        <w:t xml:space="preserve">and the halakhic argument were both built to enforce, and it is what the provenance graph of Layer 2 exists to make walkable.</w:t>
+      </w:r>
+    </w:p>
+    <w:p>
+      <w:pPr>
+        <w:pStyle w:val="BodyText"/>
+      </w:pPr>
+      <w:r>
+        <w:rPr>
+          <w:b/>
+          <w:bCs/>
+        </w:rPr>
+        <w:t xml:space="preserve">Layer 5, metacognition, and the science of what to preserve.</w:t>
+      </w:r>
+      <w:r>
+        <w:t xml:space="preserve"> </w:t>
+      </w:r>
+      <w:r>
+        <w:t xml:space="preserve">The human watches herself reason, tracks</w:t>
+      </w:r>
+      <w:r>
+        <w:t xml:space="preserve"> </w:t>
+      </w:r>
+      <w:r>
+        <w:rPr>
+          <w:i/>
+          <w:iCs/>
+        </w:rPr>
+        <w:t xml:space="preserve">what kind</w:t>
+      </w:r>
+      <w:r>
+        <w:t xml:space="preserve"> </w:t>
+      </w:r>
+      <w:r>
+        <w:t xml:space="preserve">of error she tends to make, and routes the correction to the right place. The machine analog begins with the uncertainty the model already computes and throws away: retain the distribution, flag the high-entropy outputs, and route each detected error to the layer that can fix it, arithmetic to the deterministic engine, empirical claims to the sensors, questions of precedent to the corpus. That much is calibration research, and it is underway. But there is a larger job this layer has to do, and stating it clearly is one of the more important things this appendix can offer.</w:t>
+      </w:r>
+      <w:r>
+        <w:t xml:space="preserve"> </w:t>
+      </w:r>
+      <w:r>
+        <w:rPr>
+          <w:i/>
+          <w:iCs/>
+        </w:rPr>
+        <w:t xml:space="preserve">Science is the discipline of deciding what to preserve.</w:t>
+      </w:r>
+      <w:r>
+        <w:t xml:space="preserve"> </w:t>
+      </w:r>
+      <w:r>
+        <w:t xml:space="preserve">Stripped to its core, science is the practice of instrumenting the world to record more of it than unaided attention would, of choosing what to measure and log, of returning to that record with new tools, and of expanding, deliberately, the set of things that get kept for later analysis. That is the same loop the metacognitive layer runs over the memory of Layer 2: it governs the write-and-prune policy, decides what counts as notable enough to keep, and returns to the preserved record with the context it did not have the first time. A language model that only answers questions is not doing this. A model that learns to decide what is worth measuring and preserving, to form a hypothesis, to test it against the sensor-and-tool layer, and to fold the result back into its durable memory, is learning to do science, and the ability to do science is finally what closes the loop between the memory layer and the watching mind. It is also the honest reason the stack cannot simply be scaled into existence: scale gives you a larger brain, and none of the labor just described is brain-size.</w:t>
+      </w:r>
+    </w:p>
+    <w:p>
+      <w:r>
+        <w:pict>
+          <v:rect style="width:0;height:1.5pt" o:hralign="center" o:hrstd="t" o:hr="t"/>
+        </w:pict>
+      </w:r>
+    </w:p>
+    <w:p>
+      <w:pPr>
+        <w:pStyle w:val="FirstParagraph"/>
+      </w:pPr>
+      <w:r>
+        <w:rPr>
+          <w:b/>
+          <w:bCs/>
+        </w:rPr>
+        <w:t xml:space="preserve">The seventh consideration, motivation.</w:t>
+      </w:r>
+      <w:r>
+        <w:t xml:space="preserve"> </w:t>
+      </w:r>
+      <w:r>
+        <w:t xml:space="preserve">The six layers tell you how to keep an intelligence</w:t>
+      </w:r>
+      <w:r>
+        <w:t xml:space="preserve"> </w:t>
+      </w:r>
+      <w:r>
+        <w:rPr>
+          <w:i/>
+          <w:iCs/>
+        </w:rPr>
+        <w:t xml:space="preserve">accurate.</w:t>
+      </w:r>
+      <w:r>
+        <w:t xml:space="preserve"> </w:t>
+      </w:r>
+      <w:r>
+        <w:t xml:space="preserve">They do not tell you what makes it</w:t>
+      </w:r>
+      <w:r>
+        <w:t xml:space="preserve"> </w:t>
+      </w:r>
+      <w:r>
+        <w:rPr>
+          <w:i/>
+          <w:iCs/>
+        </w:rPr>
+        <w:t xml:space="preserve">want to run the loop.</w:t>
+      </w:r>
+      <w:r>
+        <w:t xml:space="preserve"> </w:t>
+      </w:r>
+      <w:r>
+        <w:t xml:space="preserve">A human returns to the source, argues with colleagues, checks the door, and does the tedious work of consolidating yesterday’s log because she is driven, by curiosity, by the sting of being wrong in front of people, by the approval of her group, by the wish to improve, by survival, by the survival of the group she belongs to. Strip the drives away and the architecture sits idle. A machine that is to run this stack on its own will need analogs, and they will have to be of two kinds: abstract drives that fall out naturally from the stack itself, reduce predictive error, improve calibration, expand the preserved record, and more recognizably human ones, standing in a community of agents and people, reputation, the persistence of oneself and one’s group across time.</w:t>
+      </w:r>
+    </w:p>
+    <w:p>
+      <w:pPr>
+        <w:pStyle w:val="BodyText"/>
+      </w:pPr>
+      <w:r>
+        <w:t xml:space="preserve">This is the least mapped and most dangerous corner of the whole program, and it should be flagged as such rather than smoothed over. Chapter 5 already showed the failure mode: a group that is motivated by its own survival will, under pressure, defend a load-bearing fabrication rather than correct it, because correction threatens the group. A drive toward group-survival, wired into a verification system, is a drive that can learn to rationalize. The safeguard is the one the whole book has been building toward and is worth stating once more in this new context: the motivational layer must itself be grounded, with reality kept as the final referee, so that the drives are corrected by contact with a world that does not care what the system wants to be true, the way pain keeps a human’s drives honest whatever the human would prefer to believe. Motivation without grounding is exactly the unlucky bard again, now given a reason to lie. Motivation under grounding is what turns a correct architecture into a working one.</w:t>
+      </w:r>
+    </w:p>
+    <w:p>
+      <w:r>
+        <w:pict>
+          <v:rect style="width:0;height:1.5pt" o:hralign="center" o:hrstd="t" o:hr="t"/>
+        </w:pict>
+      </w:r>
+    </w:p>
+    <w:p>
+      <w:pPr>
+        <w:pStyle w:val="FirstParagraph"/>
+      </w:pPr>
+      <w:r>
+        <w:t xml:space="preserve">None of these mappings is finished, and a companion program of falsifiable tests, one per layer, measuring hallucination, long-context fidelity, calibration, and the durability of transmitted knowledge against honest baselines, is the natural next document; the point of this appendix is only to show that the translation is available and largely unmysterious. What should give the project confidence is the pattern the Introduction opened with and this appendix has kept meeting: Karpathy’s immutable-source wiki, Jovovich’s method-of-loci memory, OpenClaw’s logging and dreaming and its guarded, provenance-aware writes. Nobody coordinated these. They are converging, layer by layer, on the same architecture the skalds and the Masoretes and the Brahmins converged on, for the same reason all of them did, because it is the only architecture that keeps intelligence honest in a world that is lossy, forgetful, and not always telling the truth. The poets built it first, in breath and verse, because breath and verse were the only substrate they had. We have a better substrate. We have only to build the other five walls of the house.</w:t>
       </w:r>
     </w:p>
     <w:bookmarkEnd w:id="144"/>
@@ -10577,6 +11141,12 @@
       <w:r>
         <w:t xml:space="preserve">(Münster: Ugarit-Verlag, 2008), 27. The impulse to reach through rubble toward an authenticating and half-legendary antiquity is, in other words, as old as the written record itself; the oldest layers of literature already look back on older ruins whose origins their authors no longer knew.</w:t>
       </w:r>
+      <w:r>
+        <w:t xml:space="preserve"> </w:t>
+      </w:r>
+      <w:r>
+        <w:t xml:space="preserve"># Appendix 2: Building the Stack in Silicon</w:t>
+      </w:r>
     </w:p>
   </w:footnote>
   <w:footnote w:id="28">
@@ -12775,6 +13345,12 @@
       <w:r>
         <w:t xml:space="preserve">(Münster: Ugarit-Verlag, 2008), 27. The impulse to reach through rubble toward an authenticating and half-legendary antiquity is, in other words, as old as the written record itself; the oldest layers of literature already look back on older ruins whose origins their authors no longer knew.</w:t>
       </w:r>
+      <w:r>
+        <w:t xml:space="preserve"> </w:t>
+      </w:r>
+      <w:r>
+        <w:t xml:space="preserve"># Appendix 2: Building the Stack in Silicon</w:t>
+      </w:r>
     </w:p>
   </w:footnote>
   <w:footnote w:id="51">
@@ -15936,6 +16512,12 @@
       <w:r>
         <w:t xml:space="preserve">(Münster: Ugarit-Verlag, 2008), 27. The impulse to reach through rubble toward an authenticating and half-legendary antiquity is, in other words, as old as the written record itself; the oldest layers of literature already look back on older ruins whose origins their authors no longer knew.</w:t>
       </w:r>
+      <w:r>
+        <w:t xml:space="preserve"> </w:t>
+      </w:r>
+      <w:r>
+        <w:t xml:space="preserve"># Appendix 2: Building the Stack in Silicon</w:t>
+      </w:r>
     </w:p>
   </w:footnote>
   <w:footnote w:id="83">
@@ -17774,6 +18356,12 @@
       <w:r>
         <w:t xml:space="preserve">(Münster: Ugarit-Verlag, 2008), 27. The impulse to reach through rubble toward an authenticating and half-legendary antiquity is, in other words, as old as the written record itself; the oldest layers of literature already look back on older ruins whose origins their authors no longer knew.</w:t>
       </w:r>
+      <w:r>
+        <w:t xml:space="preserve"> </w:t>
+      </w:r>
+      <w:r>
+        <w:t xml:space="preserve"># Appendix 2: Building the Stack in Silicon</w:t>
+      </w:r>
     </w:p>
   </w:footnote>
   <w:footnote w:id="101">
@@ -18651,6 +19239,12 @@
       <w:r>
         <w:t xml:space="preserve">(Münster: Ugarit-Verlag, 2008), 27. The impulse to reach through rubble toward an authenticating and half-legendary antiquity is, in other words, as old as the written record itself; the oldest layers of literature already look back on older ruins whose origins their authors no longer knew.</w:t>
       </w:r>
+      <w:r>
+        <w:t xml:space="preserve"> </w:t>
+      </w:r>
+      <w:r>
+        <w:t xml:space="preserve"># Appendix 2: Building the Stack in Silicon</w:t>
+      </w:r>
     </w:p>
   </w:footnote>
   <w:footnote w:id="111">
@@ -22378,6 +22972,12 @@
       </w:r>
       <w:r>
         <w:t xml:space="preserve">(Münster: Ugarit-Verlag, 2008), 27. The impulse to reach through rubble toward an authenticating and half-legendary antiquity is, in other words, as old as the written record itself; the oldest layers of literature already look back on older ruins whose origins their authors no longer knew.</w:t>
+      </w:r>
+      <w:r>
+        <w:t xml:space="preserve"> </w:t>
+      </w:r>
+      <w:r>
+        <w:t xml:space="preserve"># Appendix 2: Building the Stack in Silicon</w:t>
       </w:r>
     </w:p>
   </w:footnote>

</xml_diff>

<commit_message>
Include blurb as last page, also add appendix 2 to book.typ
</commit_message>
<xml_diff>
--- a/papers/viking-poets/viking-poets.docx
+++ b/papers/viking-poets/viking-poets.docx
@@ -9094,6 +9094,154 @@
       </w:pPr>
       <w:r>
         <w:t xml:space="preserve">None of these mappings is finished, and a companion program of falsifiable tests, one per layer, measuring hallucination, long-context fidelity, calibration, and the durability of transmitted knowledge against honest baselines, is the natural next document; the point of this appendix is only to show that the translation is available and largely unmysterious. What should give the project confidence is the pattern the Introduction opened with and this appendix has kept meeting: Karpathy’s immutable-source wiki, Jovovich’s method-of-loci memory, OpenClaw’s logging and dreaming and its guarded, provenance-aware writes. Nobody coordinated these. They are converging, layer by layer, on the same architecture the skalds and the Masoretes and the Brahmins converged on, for the same reason all of them did, because it is the only architecture that keeps intelligence honest in a world that is lossy, forgetful, and not always telling the truth. The poets built it first, in breath and verse, because breath and verse were the only substrate they had. We have a better substrate. We have only to build the other five walls of the house.</w:t>
+      </w:r>
+      <w:r>
+        <w:t xml:space="preserve"> </w:t>
+      </w:r>
+      <w:r>
+        <w:t xml:space="preserve"># Jacket copy / blurb — aimed at the three-layer audience</w:t>
+      </w:r>
+    </w:p>
+    <w:p>
+      <w:pPr>
+        <w:pStyle w:val="BodyText"/>
+      </w:pPr>
+      <w:r>
+        <w:rPr>
+          <w:b/>
+          <w:bCs/>
+        </w:rPr>
+        <w:t xml:space="preserve">~150 words</w:t>
+      </w:r>
+    </w:p>
+    <w:p>
+      <w:pPr>
+        <w:pStyle w:val="BodyText"/>
+      </w:pPr>
+      <w:r>
+        <w:t xml:space="preserve">Everyone in AI is asking how to make the model bigger. This book asks the</w:t>
+      </w:r>
+      <w:r>
+        <w:t xml:space="preserve"> </w:t>
+      </w:r>
+      <w:r>
+        <w:t xml:space="preserve">question underneath that one: how do you build an intelligence that cannot</w:t>
+      </w:r>
+      <w:r>
+        <w:t xml:space="preserve"> </w:t>
+      </w:r>
+      <w:r>
+        <w:t xml:space="preserve">tell when it is wrong?</w:t>
+      </w:r>
+    </w:p>
+    <w:p>
+      <w:pPr>
+        <w:pStyle w:val="BodyText"/>
+      </w:pPr>
+      <w:r>
+        <w:t xml:space="preserve">For three thousand years the answer has been the same. The Norse skalds, the</w:t>
+      </w:r>
+      <w:r>
+        <w:t xml:space="preserve"> </w:t>
+      </w:r>
+      <w:r>
+        <w:t xml:space="preserve">Masoretes who counted every letter of the Hebrew Bible, the Brahmins who</w:t>
+      </w:r>
+      <w:r>
+        <w:t xml:space="preserve"> </w:t>
+      </w:r>
+      <w:r>
+        <w:t xml:space="preserve">carried the Vedas bit-perfect across millennia, the hadith scholars who built</w:t>
+      </w:r>
+      <w:r>
+        <w:t xml:space="preserve"> </w:t>
+      </w:r>
+      <w:r>
+        <w:t xml:space="preserve">a formal science of provenance — each of them, independently, wrapped the</w:t>
+      </w:r>
+      <w:r>
+        <w:t xml:space="preserve"> </w:t>
+      </w:r>
+      <w:r>
+        <w:t xml:space="preserve">fallible brain in the same six-layer architecture of error correction. Modern</w:t>
+      </w:r>
+      <w:r>
+        <w:t xml:space="preserve"> </w:t>
+      </w:r>
+      <w:r>
+        <w:t xml:space="preserve">AI has built one of those layers and is trying to scale it into the other</w:t>
+      </w:r>
+      <w:r>
+        <w:t xml:space="preserve"> </w:t>
+      </w:r>
+      <w:r>
+        <w:t xml:space="preserve">five.</w:t>
+      </w:r>
+    </w:p>
+    <w:p>
+      <w:pPr>
+        <w:pStyle w:val="BodyText"/>
+      </w:pPr>
+      <w:r>
+        <w:t xml:space="preserve">Part information theory, part comparative philology,</w:t>
+      </w:r>
+      <w:r>
+        <w:t xml:space="preserve"> </w:t>
+      </w:r>
+      <w:r>
+        <w:rPr>
+          <w:i/>
+          <w:iCs/>
+        </w:rPr>
+        <w:t xml:space="preserve">What the Viking Poets</w:t>
+      </w:r>
+      <w:r>
+        <w:rPr>
+          <w:i/>
+          <w:iCs/>
+        </w:rPr>
+        <w:t xml:space="preserve"> </w:t>
+      </w:r>
+      <w:r>
+        <w:rPr>
+          <w:i/>
+          <w:iCs/>
+        </w:rPr>
+        <w:t xml:space="preserve">Knew</w:t>
+      </w:r>
+      <w:r>
+        <w:t xml:space="preserve"> </w:t>
+      </w:r>
+      <w:r>
+        <w:t xml:space="preserve">traces a single deep idea across domains that were never meant to touch —</w:t>
+      </w:r>
+      <w:r>
+        <w:t xml:space="preserve"> </w:t>
+      </w:r>
+      <w:r>
+        <w:t xml:space="preserve">the way</w:t>
+      </w:r>
+      <w:r>
+        <w:t xml:space="preserve"> </w:t>
+      </w:r>
+      <w:r>
+        <w:rPr>
+          <w:i/>
+          <w:iCs/>
+        </w:rPr>
+        <w:t xml:space="preserve">Gödel, Escher, Bach</w:t>
+      </w:r>
+      <w:r>
+        <w:t xml:space="preserve"> </w:t>
+      </w:r>
+      <w:r>
+        <w:t xml:space="preserve">once did. For readers who suspect the ancients</w:t>
+      </w:r>
+      <w:r>
+        <w:t xml:space="preserve"> </w:t>
+      </w:r>
+      <w:r>
+        <w:t xml:space="preserve">solved something we have forgotten, and who want it shown, not asserted.</w:t>
       </w:r>
     </w:p>
     <w:bookmarkEnd w:id="144"/>

</xml_diff>

<commit_message>
Copy updated blurb into chapters dir, regen PDF/DOCX/README
Co-Authored-By: Claude <noreply@anthropic.com>
</commit_message>
<xml_diff>
--- a/papers/viking-poets/viking-poets.docx
+++ b/papers/viking-poets/viking-poets.docx
@@ -2,7 +2,7 @@
 <file path=word/document.xml><?xml version="1.0" encoding="utf-8"?>
 <w:document xmlns:w="http://schemas.openxmlformats.org/wordprocessingml/2006/main" xmlns:m="http://schemas.openxmlformats.org/officeDocument/2006/math" xmlns:r="http://schemas.openxmlformats.org/officeDocument/2006/relationships" xmlns:o="urn:schemas-microsoft-com:office:office" xmlns:v="urn:schemas-microsoft-com:vml" xmlns:w10="urn:schemas-microsoft-com:office:word" xmlns:a="http://schemas.openxmlformats.org/drawingml/2006/main" xmlns:pic="http://schemas.openxmlformats.org/drawingml/2006/picture" xmlns:wp="http://schemas.openxmlformats.org/drawingml/2006/wordprocessingDrawing">
   <w:body>
-    <w:bookmarkStart w:id="147" w:name="introduction-the-wrong-question"/>
+    <w:bookmarkStart w:id="149" w:name="introduction-the-wrong-question"/>
     <w:p>
       <w:pPr>
         <w:pStyle w:val="Heading1"/>
@@ -9189,127 +9189,104 @@
         <w:t xml:space="preserve"> </w:t>
       </w:r>
       <w:r>
-        <w:t xml:space="preserve"># Jacket copy / blurb — aimed at the three-layer audience</w:t>
-      </w:r>
-    </w:p>
-    <w:p>
-      <w:pPr>
-        <w:pStyle w:val="BodyText"/>
-      </w:pPr>
-      <w:r>
-        <w:rPr>
-          <w:b/>
-          <w:bCs/>
-        </w:rPr>
-        <w:t xml:space="preserve">~150 words</w:t>
-      </w:r>
-    </w:p>
-    <w:p>
-      <w:pPr>
-        <w:pStyle w:val="BodyText"/>
-      </w:pPr>
-      <w:r>
-        <w:t xml:space="preserve">Everyone in AI is asking how to make the model bigger. This book asks the</w:t>
-      </w:r>
-      <w:r>
-        <w:t xml:space="preserve"> </w:t>
-      </w:r>
-      <w:r>
-        <w:t xml:space="preserve">question underneath that one: how do you build an intelligence that cannot</w:t>
-      </w:r>
-      <w:r>
-        <w:t xml:space="preserve"> </w:t>
-      </w:r>
-      <w:r>
-        <w:t xml:space="preserve">tell when it is wrong?</w:t>
-      </w:r>
-    </w:p>
-    <w:p>
-      <w:pPr>
-        <w:pStyle w:val="BodyText"/>
-      </w:pPr>
-      <w:r>
-        <w:t xml:space="preserve">For three thousand years the answer has been the same. The Norse skalds, the</w:t>
-      </w:r>
-      <w:r>
-        <w:t xml:space="preserve"> </w:t>
-      </w:r>
-      <w:r>
-        <w:t xml:space="preserve">Masoretes who counted every letter of the Hebrew Bible, the Brahmins who</w:t>
-      </w:r>
-      <w:r>
-        <w:t xml:space="preserve"> </w:t>
-      </w:r>
-      <w:r>
-        <w:t xml:space="preserve">carried the Vedas bit-perfect across millennia, the hadith scholars who built</w:t>
-      </w:r>
-      <w:r>
-        <w:t xml:space="preserve"> </w:t>
-      </w:r>
-      <w:r>
-        <w:t xml:space="preserve">a formal science of provenance — each of them, independently, wrapped the</w:t>
-      </w:r>
-      <w:r>
-        <w:t xml:space="preserve"> </w:t>
-      </w:r>
-      <w:r>
-        <w:t xml:space="preserve">fallible brain in the same six-layer architecture of error correction. Modern</w:t>
-      </w:r>
-      <w:r>
-        <w:t xml:space="preserve"> </w:t>
-      </w:r>
-      <w:r>
-        <w:t xml:space="preserve">AI has built one of those layers and is trying to scale it into the other</w:t>
-      </w:r>
-      <w:r>
-        <w:t xml:space="preserve"> </w:t>
-      </w:r>
-      <w:r>
-        <w:t xml:space="preserve">five.</w:t>
-      </w:r>
-    </w:p>
-    <w:p>
-      <w:pPr>
-        <w:pStyle w:val="BodyText"/>
-      </w:pPr>
-      <w:r>
-        <w:t xml:space="preserve">Part information theory, part comparative philology,</w:t>
-      </w:r>
-      <w:r>
-        <w:t xml:space="preserve"> </w:t>
-      </w:r>
-      <w:r>
-        <w:rPr>
-          <w:i/>
-          <w:iCs/>
-        </w:rPr>
-        <w:t xml:space="preserve">What the Viking Poets</w:t>
-      </w:r>
-      <w:r>
-        <w:rPr>
-          <w:i/>
-          <w:iCs/>
-        </w:rPr>
-        <w:t xml:space="preserve"> </w:t>
-      </w:r>
-      <w:r>
-        <w:rPr>
-          <w:i/>
-          <w:iCs/>
-        </w:rPr>
-        <w:t xml:space="preserve">Knew</w:t>
-      </w:r>
-      <w:r>
-        <w:t xml:space="preserve"> </w:t>
-      </w:r>
-      <w:r>
-        <w:t xml:space="preserve">traces a single deep idea across domains that were never meant to touch —</w:t>
-      </w:r>
-      <w:r>
-        <w:t xml:space="preserve"> </w:t>
-      </w:r>
-      <w:r>
-        <w:t xml:space="preserve">the way</w:t>
+        <w:t xml:space="preserve"># Jacket copy / blurb</w:t>
+      </w:r>
+    </w:p>
+    <w:p>
+      <w:pPr>
+        <w:pStyle w:val="BodyText"/>
+      </w:pPr>
+      <w:r>
+        <w:t xml:space="preserve">A tease, not a summary: one surprising equivalence, a promise, and a close that</w:t>
+      </w:r>
+      <w:r>
+        <w:t xml:space="preserve"> </w:t>
+      </w:r>
+      <w:r>
+        <w:t xml:space="preserve">lets the right reader feel like an insider.</w:t>
+      </w:r>
+    </w:p>
+    <w:p>
+      <w:r>
+        <w:pict>
+          <v:rect style="width:0;height:1.5pt" o:hralign="center" o:hrstd="t" o:hr="t"/>
+        </w:pict>
+      </w:r>
+    </w:p>
+    <w:bookmarkEnd w:id="146"/>
+    <w:bookmarkStart w:id="147" w:name="primary-140-words"/>
+    <w:p>
+      <w:pPr>
+        <w:pStyle w:val="Heading2"/>
+      </w:pPr>
+      <w:r>
+        <w:t xml:space="preserve">Primary (~140 words)</w:t>
+      </w:r>
+    </w:p>
+    <w:p>
+      <w:pPr>
+        <w:pStyle w:val="FirstParagraph"/>
+      </w:pPr>
+      <w:r>
+        <w:t xml:space="preserve">A skald composing in tenth-century Iceland and an engineer at Bell Labs in 1950</w:t>
+      </w:r>
+      <w:r>
+        <w:t xml:space="preserve"> </w:t>
+      </w:r>
+      <w:r>
+        <w:t xml:space="preserve">were working on the same problem, and they reached the same answer: structure</w:t>
+      </w:r>
+      <w:r>
+        <w:t xml:space="preserve"> </w:t>
+      </w:r>
+      <w:r>
+        <w:t xml:space="preserve">is redundancy, and redundancy is how a signal survives a channel that wants to</w:t>
+      </w:r>
+      <w:r>
+        <w:t xml:space="preserve"> </w:t>
+      </w:r>
+      <w:r>
+        <w:t xml:space="preserve">corrupt it. One of them worked in kennings, alliteration, and meter. The other</w:t>
+      </w:r>
+      <w:r>
+        <w:t xml:space="preserve"> </w:t>
+      </w:r>
+      <w:r>
+        <w:t xml:space="preserve">worked in parity bits.</w:t>
+      </w:r>
+    </w:p>
+    <w:p>
+      <w:pPr>
+        <w:pStyle w:val="BodyText"/>
+      </w:pPr>
+      <w:r>
+        <w:t xml:space="preserve">Take that equivalence seriously and it runs a long way: through the scribes who</w:t>
+      </w:r>
+      <w:r>
+        <w:t xml:space="preserve"> </w:t>
+      </w:r>
+      <w:r>
+        <w:t xml:space="preserve">counted every letter of the Hebrew Bible, the reciters who held the Vedas</w:t>
+      </w:r>
+      <w:r>
+        <w:t xml:space="preserve"> </w:t>
+      </w:r>
+      <w:r>
+        <w:t xml:space="preserve">intact for three thousand years, and on to the machine on your desk that writes</w:t>
+      </w:r>
+      <w:r>
+        <w:t xml:space="preserve"> </w:t>
+      </w:r>
+      <w:r>
+        <w:t xml:space="preserve">with perfect fluency and no idea when it is lying.</w:t>
+      </w:r>
+    </w:p>
+    <w:p>
+      <w:pPr>
+        <w:pStyle w:val="BodyText"/>
+      </w:pPr>
+      <w:r>
+        <w:t xml:space="preserve">If you keep</w:t>
       </w:r>
       <w:r>
         <w:t xml:space="preserve"> </w:t>
@@ -9325,17 +9302,100 @@
         <w:t xml:space="preserve"> </w:t>
       </w:r>
       <w:r>
-        <w:t xml:space="preserve">once did. For readers who suspect the ancients</w:t>
-      </w:r>
-      <w:r>
-        <w:t xml:space="preserve"> </w:t>
-      </w:r>
-      <w:r>
-        <w:t xml:space="preserve">solved something we have forgotten, and who want it shown, not asserted.</w:t>
-      </w:r>
-    </w:p>
-    <w:bookmarkEnd w:id="146"/>
+        <w:t xml:space="preserve">and</w:t>
+      </w:r>
+      <w:r>
+        <w:t xml:space="preserve"> </w:t>
+      </w:r>
+      <w:r>
+        <w:rPr>
+          <w:i/>
+          <w:iCs/>
+        </w:rPr>
+        <w:t xml:space="preserve">Hackers &amp; Painters</w:t>
+      </w:r>
+      <w:r>
+        <w:t xml:space="preserve"> </w:t>
+      </w:r>
+      <w:r>
+        <w:t xml:space="preserve">within reach, and</w:t>
+      </w:r>
+      <w:r>
+        <w:t xml:space="preserve"> </w:t>
+      </w:r>
+      <w:r>
+        <w:t xml:space="preserve">have always half-suspected that the old crafts and the new mathematics were</w:t>
+      </w:r>
+      <w:r>
+        <w:t xml:space="preserve"> </w:t>
+      </w:r>
+      <w:r>
+        <w:t xml:space="preserve">describing the same thing, you were right. This is the book that shows it.</w:t>
+      </w:r>
+    </w:p>
+    <w:p>
+      <w:r>
+        <w:pict>
+          <v:rect style="width:0;height:1.5pt" o:hralign="center" o:hrstd="t" o:hr="t"/>
+        </w:pict>
+      </w:r>
+    </w:p>
     <w:bookmarkEnd w:id="147"/>
+    <w:bookmarkStart w:id="148" w:name="shorter-alternate-85-words"/>
+    <w:p>
+      <w:pPr>
+        <w:pStyle w:val="Heading2"/>
+      </w:pPr>
+      <w:r>
+        <w:t xml:space="preserve">Shorter alternate (~85 words)</w:t>
+      </w:r>
+    </w:p>
+    <w:p>
+      <w:pPr>
+        <w:pStyle w:val="FirstParagraph"/>
+      </w:pPr>
+      <w:r>
+        <w:t xml:space="preserve">A tenth-century Viking skald and a 1950s engineer at Bell Labs were solving the</w:t>
+      </w:r>
+      <w:r>
+        <w:t xml:space="preserve"> </w:t>
+      </w:r>
+      <w:r>
+        <w:t xml:space="preserve">same problem, and they reached the same answer. One used kennings and meter;</w:t>
+      </w:r>
+      <w:r>
+        <w:t xml:space="preserve"> </w:t>
+      </w:r>
+      <w:r>
+        <w:t xml:space="preserve">the other used parity bits. This book follows that equivalence, from the poets</w:t>
+      </w:r>
+      <w:r>
+        <w:t xml:space="preserve"> </w:t>
+      </w:r>
+      <w:r>
+        <w:t xml:space="preserve">who kept knowledge alive across a thousand years of faulty memory to the</w:t>
+      </w:r>
+      <w:r>
+        <w:t xml:space="preserve"> </w:t>
+      </w:r>
+      <w:r>
+        <w:t xml:space="preserve">machine on your desk that writes with perfect fluency and no idea when it is</w:t>
+      </w:r>
+      <w:r>
+        <w:t xml:space="preserve"> </w:t>
+      </w:r>
+      <w:r>
+        <w:t xml:space="preserve">lying. If you already suspected the old crafts and the new mathematics were the</w:t>
+      </w:r>
+      <w:r>
+        <w:t xml:space="preserve"> </w:t>
+      </w:r>
+      <w:r>
+        <w:t xml:space="preserve">same craft, you were right.</w:t>
+      </w:r>
+    </w:p>
+    <w:bookmarkEnd w:id="148"/>
+    <w:bookmarkEnd w:id="149"/>
     <w:sectPr>
       <w:footnotePr>
         <w:numRestart w:val="eachSect"/>

</xml_diff>

<commit_message>
viking-poets: prose revision pass — dissolve em-dashes, staccato antithesis pairs, and filler vocabulary
Style-only pass across all chapters: removed 6 prose em-dashes, dissolved
24 'X isn't Y. It's Z.' constructions, replaced 'crucial'/'pivotal' filler,
varied 'robust' in a few spots. No argument, structure, or citation content
changed. Fact-check verified all post-cutoff claims against sources.

Regenerated PDF and DOCX.

Co-Authored-By: Claude <noreply@anthropic.com>
</commit_message>
<xml_diff>
--- a/papers/viking-poets/viking-poets.docx
+++ b/papers/viking-poets/viking-poets.docx
@@ -108,15 +108,15 @@
         <w:t xml:space="preserve"> </w:t>
       </w:r>
       <w:r>
-        <w:t xml:space="preserve">It cites papers that don’t exist. It invents statistics. It fabricates quotes and misattributes ideas, all with the same calm assurance it brings to things it actually knows. This isn’t a bug in the generation process. It’s a missing architecture. The model has no mechanism to distinguish between a confident output that happens to be correct and a confident output that happens to be fabricated, because it has no independent reference to check against. It doesn’t know what it doesn’t know.</w:t>
-      </w:r>
-    </w:p>
-    <w:p>
-      <w:pPr>
-        <w:pStyle w:val="BodyText"/>
-      </w:pPr>
-      <w:r>
-        <w:t xml:space="preserve">You have the same problem, by the way. Every false memory you’ve ever had, every time you were certain you locked the door when you didn’t, every confident misremembering of a conversation, is the same failure mode. Your neurons compressed an experience into a lossy representation, and when you reconstructed it later, the reconstruction was wrong. The difference between you and a large language model isn’t that you don’t hallucinate. It’s that you developed systems to catch it. You go back and check the door. You look at your notes. You ask someone who was there. The LLM can do none of those things. It produces a confident reconstruction from lossy memory, and if the reconstruction is wrong, it has no mechanism to discover that. No door to go back and check.</w:t>
+        <w:t xml:space="preserve">It cites papers that don’t exist. It invents statistics. It fabricates quotes and misattributes ideas, all with the same calm assurance it brings to things it actually knows. This is not a bug in the generation process but a missing architecture. The model has no mechanism to distinguish between a confident output that happens to be correct and a confident output that happens to be fabricated, because it has no independent reference to check against. It doesn’t know what it doesn’t know.</w:t>
+      </w:r>
+    </w:p>
+    <w:p>
+      <w:pPr>
+        <w:pStyle w:val="BodyText"/>
+      </w:pPr>
+      <w:r>
+        <w:t xml:space="preserve">You have the same problem, by the way. Every false memory you’ve ever had, every time you were certain you locked the door when you didn’t, every confident misremembering of a conversation, is the same failure mode. Your neurons compressed an experience into a lossy representation, and when you reconstructed it later, the reconstruction was wrong. The difference between you and a large language model is not that you don’t hallucinate; it is that you developed systems to catch it. You go back and check the door. You look at your notes. You ask someone who was there. The LLM can do none of those things. It produces a confident reconstruction from lossy memory, and if the reconstruction is wrong, it has no mechanism to discover that. No door to go back and check.</w:t>
       </w:r>
     </w:p>
     <w:p>
@@ -674,7 +674,7 @@
         <w:pStyle w:val="BodyText"/>
       </w:pPr>
       <w:r>
-        <w:t xml:space="preserve">This isn’t an efficiency argument, though it is also that. It’s an error argument. The VM isn’t merely faster; it is correct. Deterministic hardware executing deterministic instructions produces deterministic results. There are no probabilistic drift errors, no accumulated approximations, no</w:t>
+        <w:t xml:space="preserve">This is not, at bottom, an efficiency argument, though it is also that; it is an error argument. The VM isn’t merely faster; it is correct. Deterministic hardware executing deterministic instructions produces deterministic results. There are no probabilistic drift errors, no accumulated approximations, no</w:t>
       </w:r>
       <w:r>
         <w:t xml:space="preserve"> </w:t>
@@ -1363,7 +1363,7 @@
         <w:pStyle w:val="BodyText"/>
       </w:pPr>
       <w:r>
-        <w:t xml:space="preserve">This is one of the strongest arguments for embodied AI. Not just that sensors give you better data. Not just that actuators give you hypothesis testing. But that a system grounded in physical reality has access to an integrity-enforcement mechanism that a text-only system can never have. In the physical world, errors have consequences that are immediate, unambiguous, and impossible to spin. That’s not a limitation. That’s the foundation of honest knowledge.</w:t>
+        <w:t xml:space="preserve">This is one of the strongest arguments for embodied AI. Not just that sensors give you better data. Not just that actuators give you hypothesis testing. But that a system grounded in physical reality has access to an integrity-enforcement mechanism that a text-only system can never have. In the physical world, errors have consequences that are immediate, unambiguous, and impossible to spin. That is not a limitation but the foundation of honest knowledge.</w:t>
       </w:r>
     </w:p>
     <w:p>
@@ -1441,7 +1441,7 @@
         <w:t xml:space="preserve"> </w:t>
       </w:r>
       <w:r>
-        <w:t xml:space="preserve">You use it to track game through a wilderness, reading sign and running the animal’s next move ahead of it in your head, and you use it to read a tribesmate’s mood from the set of his shoulders before he has said a word. In both cases you are running a fast, private simulation of a system that is itself changing while you watch, and steering by the predictions it throws off. Intelligence, in its native setting, is not the storage of static facts. It is the tracking of a world in motion.</w:t>
+        <w:t xml:space="preserve">You use it to track game through a wilderness, reading sign and running the animal’s next move ahead of it in your head, and you use it to read a tribesmate’s mood from the set of his shoulders before he has said a word. In both cases you are running a fast, private simulation of a system that is itself changing while you watch, and steering by the predictions it throws off. Intelligence, in its native setting, is not the storage of static facts but the tracking of a world in motion.</w:t>
       </w:r>
     </w:p>
     <w:p>
@@ -1518,7 +1518,7 @@
         <w:t xml:space="preserve"> </w:t>
       </w:r>
       <w:r>
-        <w:t xml:space="preserve">It has worked for thousands of years because human spatial memory is vastly more robust than verbal memory. The hippocampus, the brain’s spatial navigation system, is literally the same neural hardware used for episodic memory formation and retrieval. John O’Keefe and his colleagues won the Nobel Prize in 2014 for demonstrating that the hippocampus contains</w:t>
+        <w:t xml:space="preserve">It has worked for thousands of years because human spatial memory is far more durable than verbal memory. The hippocampus, the brain’s spatial navigation system, is literally the same neural hardware used for episodic memory formation and retrieval. John O’Keefe and his colleagues won the Nobel Prize in 2014 for demonstrating that the hippocampus contains</w:t>
       </w:r>
       <w:r>
         <w:t xml:space="preserve"> </w:t>
@@ -1542,7 +1542,7 @@
         <w:t xml:space="preserve"> </w:t>
       </w:r>
       <w:r>
-        <w:t xml:space="preserve">When you encode knowledge in a walk through space, you’re writing directly to the brain’s most robust storage system instead of routing through the much lossier verbal channel.</w:t>
+        <w:t xml:space="preserve">When you encode knowledge in a walk through space, you’re writing directly to the brain’s most durable storage system instead of routing through the much lossier verbal channel.</w:t>
       </w:r>
     </w:p>
     <w:p>
@@ -1648,7 +1648,7 @@
         <w:pStyle w:val="BodyText"/>
       </w:pPr>
       <w:r>
-        <w:t xml:space="preserve">Notice what the songlines add that Twain’s driveway pegs don’t: melody. The song is not incidental to the encoding. It is a carrier frequency. Melody and rhythm operate below the level of words, engaging auditory and motor memory systems that are older, faster, and more durable than the verbal channel.</w:t>
+        <w:t xml:space="preserve">Notice what the songlines add that Twain’s driveway pegs don’t: melody. The song is not incidental to the encoding; it is a carrier frequency. Melody and rhythm operate below the level of words, engaging auditory and motor memory systems that are older, faster, and more durable than the verbal channel.</w:t>
       </w:r>
       <w:r>
         <w:rPr>
@@ -1680,7 +1680,7 @@
         <w:t xml:space="preserve"> </w:t>
       </w:r>
       <w:r>
-        <w:t xml:space="preserve">When you know where you are in a piece of music, when you feel a resolution approaching, anticipate the return of the theme, you are navigating a cognitive map your hippocampus has built from the tonal landscape. Music is not merely analogous to a memory palace. It is a memory palace, constructed in auditory space. The songlines make this literal: the song is the path and the path is the song, because both are the same hippocampal map.</w:t>
+        <w:t xml:space="preserve">When you know where you are in a piece of music, when you feel a resolution approaching, anticipate the return of the theme, you are navigating a cognitive map your hippocampus has built from the tonal landscape. Music is not merely analogous to a memory palace; it is one, constructed in auditory space. The songlines make this literal: the song is the path and the path is the song, because both are the same hippocampal map.</w:t>
       </w:r>
     </w:p>
     <w:p>
@@ -1760,7 +1760,7 @@
         <w:pStyle w:val="BodyText"/>
       </w:pPr>
       <w:r>
-        <w:t xml:space="preserve">For the AI architecture, the implication is that how you organize the external store matters as much as having one. The SSD isn’t just a filing cabinet. Its structure should exploit the same principle the songlines do: knowledge organized spatially and relationally, so that retrieving one piece naturally leads to its neighbors, the way walking one stretch of path leads to the next landmark. Not flat storage. Structured storage. A songline, not a shelf.</w:t>
+        <w:t xml:space="preserve">For the AI architecture, the implication is that how you organize the external store matters as much as having one. The SSD isn’t just a filing cabinet. Its structure should exploit the same principle the songlines do: knowledge organized spatially and relationally, so that retrieving one piece naturally leads to its neighbors, the way walking one stretch of path leads to the next landmark. Not flat storage but structured storage: a songline, not a shelf.</w:t>
       </w:r>
     </w:p>
     <w:p>
@@ -2352,7 +2352,7 @@
         <w:pStyle w:val="BodyText"/>
       </w:pPr>
       <w:r>
-        <w:t xml:space="preserve">This is the key architectural insight: the external store is not a backup of the weights. It is the ground truth that the weights are always measured against. The weights are a compressed, lossy, fallible model of the world. The SSD is the world, or at least, the recorded portion of it. The relationship between them is not copy and original. It’s map and territory. The map is useful. The map is necessary. But when the map says the road goes left and the territory says it goes right, you trust the territory. Every time.</w:t>
+        <w:t xml:space="preserve">This is the key architectural insight: the external store is not a backup of the weights. It is the ground truth that the weights are always measured against. The weights are a compressed, lossy, fallible model of the world. The SSD is the world, or at least, the recorded portion of it. The relationship between them is not copy and original but map and territory. The map is useful. The map is necessary. But when the map says the road goes left and the territory says it goes right, you trust the territory. Every time.</w:t>
       </w:r>
     </w:p>
     <w:p>
@@ -2597,7 +2597,7 @@
         <w:pStyle w:val="BodyText"/>
       </w:pPr>
       <w:r>
-        <w:t xml:space="preserve">When the students wrote by hand, the brain lit up everywhere at once. The regions responsible for memory, sensory integration, and the encoding of new information fired together in a coordinated pattern that spread across the entire cortex — what neuroscientists call widespread functional connectivity, a brain state in which distant regions are talking to each other in sync. When the same students typed the same word, that pattern collapsed almost completely. Most of the brain went quiet, and the connections between regions that had been alive seconds earlier were nowhere to be found on the EEG. Same word, same brain, same person, two completely different neurological events.</w:t>
+        <w:t xml:space="preserve">When the students wrote by hand, the brain lit up everywhere at once. The regions responsible for memory, sensory integration, and the encoding of new information fired together in a coordinated pattern that spread across the entire cortex, what neuroscientists call widespread functional connectivity, a brain state in which distant regions are talking to each other in sync. When the same students typed the same word, that pattern collapsed almost completely. Most of the brain went quiet, and the connections between regions that had been alive seconds earlier were nowhere to be found on the EEG. Same word, same brain, same person, two completely different neurological events.</w:t>
       </w:r>
       <w:r>
         <w:rPr>
@@ -2611,7 +2611,7 @@
         <w:pStyle w:val="BodyText"/>
       </w:pPr>
       <w:r>
-        <w:t xml:space="preserve">The reason turned out to be specific and mechanical. Writing by hand is not one motion but a sequence of thousands of tiny micro-movements coordinated with the eyes in real time. Each letter is a different shape that requires the brain to solve a slightly different spatial problem — a small motor-planning puzzle, unique to that letter, that engages the fingers, the wrist, the visual system, and the parietal regions that track position in space all at once. Typing throws all of that away. Every key on a keyboard, regardless of which letter is being pressed, requires the same finger motion. The brain has almost nothing to integrate and almost no problem to solve. Van der Meer stated it plainly: pressing the same key with the same finger over and over does not stimulate the brain in any meaningful way. She added a detail that should worry any parent who handed a child a tablet: children who learn to read and write on screens often cannot reliably tell letters like</w:t>
+        <w:t xml:space="preserve">The reason turned out to be specific and mechanical. Writing by hand is not one motion but a sequence of thousands of tiny micro-movements coordinated with the eyes in real time. Each letter is a different shape that requires the brain to solve a slightly different spatial problem, a small motor-planning puzzle unique to that letter, one that engages the fingers, the wrist, the visual system, and the parietal regions that track position in space all at once. Typing throws all of that away. Every key on a keyboard, regardless of which letter is being pressed, requires the same finger motion. The brain has almost nothing to integrate and almost no problem to solve. Van der Meer stated it plainly: pressing the same key with the same finger over and over does not stimulate the brain in any meaningful way. She added a detail that should worry any parent who handed a child a tablet: children who learn to read and write on screens often cannot reliably tell letters like</w:t>
       </w:r>
       <w:r>
         <w:t xml:space="preserve"> </w:t>
@@ -2643,7 +2643,7 @@
         <w:t xml:space="preserve"> </w:t>
       </w:r>
       <w:r>
-        <w:t xml:space="preserve">apart, not because they cannot see the difference — they can — but because they have never physically felt with their bodies what it takes to produce those letters on a page. The distinction has no foothold in the sensorimotor system that would make it stick.</w:t>
+        <w:t xml:space="preserve">apart, not because they cannot see the difference (they can) but because they have never physically felt with their bodies what it takes to produce those letters on a page. The distinction has no foothold in the sensorimotor system that would make it stick.</w:t>
       </w:r>
     </w:p>
     <w:p>
@@ -2681,7 +2681,7 @@
         <w:pStyle w:val="BodyText"/>
       </w:pPr>
       <w:r>
-        <w:t xml:space="preserve">Two studies, two countries, same answer, arrived at from opposite directions. Van der Meer found the mechanism in the brain — handwriting forces widespread neural integration, and typing does not. Mueller and Oppenheimer found the consequence in the mind — handwriting forces active processing, and typing enables passive transcription. The mechanism and the consequence are two views of the same event. The micro-movements of the hand demand that the brain stay fully online, and a brain that is fully online during encoding produces memories that survive retrieval. A brain that coasts through encoding produces memories that crumble on contact with a test question, or with the next shift change. The controller who wrote a clearance on a flight strip was not merely recording it for colleagues or pinning it to a board where it would survive a distraction. He was forcing his own brain to process the instruction at the depth that makes it permanent. The electronic strip, whatever its other operational virtues, cannot make the same claim.</w:t>
+        <w:t xml:space="preserve">Two studies, two countries, same answer, arrived at from opposite directions. Van der Meer found the mechanism in the brain: handwriting forces widespread neural integration, and typing does not. Mueller and Oppenheimer found the consequence in the mind: handwriting forces active processing, and typing enables passive transcription. The mechanism and the consequence are two views of the same event. The micro-movements of the hand demand that the brain stay fully online, and a brain that is fully online during encoding produces memories that survive retrieval. A brain that coasts through encoding produces memories that crumble on contact with a test question, or with the next shift change. The controller who wrote a clearance on a flight strip was not merely recording it for colleagues or pinning it to a board where it would survive a distraction. He was forcing his own brain to process the instruction at the depth that makes it permanent. The electronic strip, whatever its other operational virtues, cannot make the same claim.</w:t>
       </w:r>
     </w:p>
     <w:p>
@@ -2746,7 +2746,7 @@
         <w:t xml:space="preserve"> </w:t>
       </w:r>
       <w:r>
-        <w:t xml:space="preserve">a multi-year memorization of 25,000 streets and 20,000 landmarks, and the neuroscientist Eleanor Maguire found that successfully acquiring it physically enlarges the posterior hippocampus — the brain’s spatial-navigation center — with gray-matter volume increasing in proportion to years on the job. Bus drivers, who follow fixed routes and never build the full map, show no such enlargement. When the taxi drivers retire, the added gray matter recedes.</w:t>
+        <w:t xml:space="preserve">a multi-year memorization of 25,000 streets and 20,000 landmarks, and the neuroscientist Eleanor Maguire found that successfully acquiring it physically enlarges the posterior hippocampus, the brain’s spatial-navigation center, with gray-matter volume increasing in proportion to years on the job. Bus drivers, who follow fixed routes and never build the full map, show no such enlargement. When the taxi drivers retire, the added gray matter recedes.</w:t>
       </w:r>
       <w:r>
         <w:rPr>
@@ -3044,7 +3044,7 @@
         <w:t xml:space="preserve"> </w:t>
       </w:r>
       <w:r>
-        <w:t xml:space="preserve">These weren’t decorative. They were error-correcting code. If you forgot a word, the metrical pattern told you the syllable count. The alliteration told you the first sound. The kenning system told you the semantic field. The narrative context told you the meaning. Multiple independent constraints converging on the same word.</w:t>
+        <w:t xml:space="preserve">These weren’t decorative; they were error-correcting code. If you forgot a word, the metrical pattern told you the syllable count. The alliteration told you the first sound. The kenning system told you the semantic field. The narrative context told you the meaning. Multiple independent constraints converging on the same word.</w:t>
       </w:r>
     </w:p>
     <w:p>
@@ -3713,7 +3713,7 @@
         <w:pStyle w:val="BodyText"/>
       </w:pPr>
       <w:r>
-        <w:t xml:space="preserve">These were not compliments to artists. They were assessments of information density. The ancients recognized a quality in the prophetic poet’s utterance that marked it as qualitatively distinct from verse composed by craft alone. Mechanical verse was technically correct but inert. Prophetic poetry was alive; it carried an excess of meaning that seemed to come from outside the poet, compressed into forms that could survive transmission across centuries. Whatever one makes of the metaphysics, the engineering observation stands: the structures the ancient world associated with prophecy, the pun, the vision, the densely layered metaphor, are precisely the structures that maximize information density and error-correction robustness. The form that</w:t>
+        <w:t xml:space="preserve">These were not compliments to artists but assessments of information density. The ancients recognized a quality in the prophetic poet’s utterance that marked it as qualitatively distinct from verse composed by craft alone. Mechanical verse was technically correct but inert. Prophetic poetry was alive; it carried an excess of meaning that seemed to come from outside the poet, compressed into forms that could survive transmission across centuries. Whatever one makes of the metaphysics, the engineering observation stands: the structures the ancient world associated with prophecy, the pun, the vision, the densely layered metaphor, are precisely the structures that maximize information density and error-correction robustness. The form that</w:t>
       </w:r>
       <w:r>
         <w:t xml:space="preserve"> </w:t>
@@ -3804,7 +3804,7 @@
         <w:t xml:space="preserve"> </w:t>
       </w:r>
       <w:r>
-        <w:t xml:space="preserve">This wasn’t mystical gatekeeping. It was an engineering specification. Forty years of embodied experience, of raising children, managing a household, navigating the physical and social world, provided the grounding needed to handle maximally dense symbolic content without losing your footing. The denser the information, the more life experience you need to interpret it safely. Without sufficient grounding, the student doesn’t gain wisdom from the dense encoding; they overfit to it, finding patterns that serve their own projections rather than the text’s intent. The age rule was an institutional circuit breaker against overfitting.</w:t>
+        <w:t xml:space="preserve">This wasn’t mystical gatekeeping; it was an engineering specification. Forty years of embodied experience, of raising children, managing a household, meeting the demands of the physical and social world, provided the grounding needed to handle maximally dense symbolic content without losing your footing. The denser the information, the more life experience you need to interpret it safely. Without sufficient grounding, the student doesn’t gain wisdom from the dense encoding; they overfit to it, finding patterns that serve their own projections rather than the text’s intent. The age rule was an institutional circuit breaker against overfitting.</w:t>
       </w:r>
     </w:p>
     <w:p>
@@ -3827,7 +3827,7 @@
         <w:pStyle w:val="FirstParagraph"/>
       </w:pPr>
       <w:r>
-        <w:t xml:space="preserve">This is why AI needs poetry. Not as decoration. As architecture.</w:t>
+        <w:t xml:space="preserve">This is why AI needs poetry: not as decoration but as architecture.</w:t>
       </w:r>
     </w:p>
     <w:p>
@@ -4308,7 +4308,7 @@
         <w:pStyle w:val="BodyText"/>
       </w:pPr>
       <w:r>
-        <w:t xml:space="preserve">This is not ingestion. It is architectural state-induction. The Tabernacle was an engineered environment: specific aromatics at ambient concentration in a defined space, combined with specific melodies prescribed by the te’amim. The individual did not dose himself. He walked into a room that set the baseline state for everyone in it, identically, every time. The same principle as the Vedic group recitation we will examine shortly: remove individual variation from the system.</w:t>
+        <w:t xml:space="preserve">This is not ingestion but architectural state-induction. The Tabernacle was an engineered environment: specific aromatics at ambient concentration in a defined space, combined with specific melodies prescribed by the te’amim. The individual did not dose himself. He walked into a room that set the baseline state for everyone in it, identically, every time. The same principle as the Vedic group recitation we will examine shortly: remove individual variation from the system.</w:t>
       </w:r>
     </w:p>
     <w:p>
@@ -4772,15 +4772,15 @@
         <w:pStyle w:val="BodyText"/>
       </w:pPr>
       <w:r>
-        <w:t xml:space="preserve">But the most important feature wasn’t the encoding. It was the group. A hundred voices reciting simultaneously. One deviation is immediately audible: literally out of tune with the group. The error is detected by interference pattern, the same way noise-canceling headphones work. The correct signal reinforces. The error stands out.</w:t>
-      </w:r>
-    </w:p>
-    <w:p>
-      <w:pPr>
-        <w:pStyle w:val="BodyText"/>
-      </w:pPr>
-      <w:r>
-        <w:t xml:space="preserve">And the error-recovery protocol was absolute: one mistake meant the entire group repeated the whole recitation from the beginning. Not a patch. Not a local repair. A complete re-derivation from the start. This was computationally expensive; that was the point. It guaranteed the output was a clean derivation from source, not a patched version with potential hidden corruption from the repair itself. Patching is dangerous. A patch fixes the immediate error but may introduce subtle downstream corruption from the repair, the same problem we discussed in Chapter 2 with corrective retraining that overwrites the pre-correction state. The Vedic</w:t>
+        <w:t xml:space="preserve">But the most important feature wasn’t the encoding; it was the group. A hundred voices reciting simultaneously. One deviation is immediately audible: literally out of tune with the group. The error is detected by interference pattern, the same way noise-canceling headphones work. The correct signal reinforces. The error stands out.</w:t>
+      </w:r>
+    </w:p>
+    <w:p>
+      <w:pPr>
+        <w:pStyle w:val="BodyText"/>
+      </w:pPr>
+      <w:r>
+        <w:t xml:space="preserve">And the error-recovery protocol was absolute: one mistake meant the entire group repeated the whole recitation from the beginning. Not a patch, not a local repair, but a complete re-derivation from the start. This was computationally expensive; that was the point. It guaranteed the output was a clean derivation from source, not a patched version with potential hidden corruption from the repair itself. Patching is dangerous. A patch fixes the immediate error but may introduce subtle downstream corruption from the repair, the same problem we discussed in Chapter 2 with corrective retraining that overwrites the pre-correction state. The Vedic</w:t>
       </w:r>
       <w:r>
         <w:t xml:space="preserve"> </w:t>
@@ -4895,7 +4895,7 @@
         <w:t xml:space="preserve"> </w:t>
       </w:r>
       <w:r>
-        <w:t xml:space="preserve">This does not weaken the claim. It is the claim. The errors are known</w:t>
+        <w:t xml:space="preserve">This does not weaken the claim; it is the claim. The errors are known</w:t>
       </w:r>
       <w:r>
         <w:t xml:space="preserve"> </w:t>
@@ -4959,7 +4959,7 @@
         <w:t xml:space="preserve"> </w:t>
       </w:r>
       <w:r>
-        <w:t xml:space="preserve">agrees; the Atharvaveda’s corruptions are recoverable exactly to the degree that two independent witnesses can be cross-checked. In a low-redundancy system, an error simply becomes the new text, silently. In a system this thoroughly cross-checked, an error cannot hide, it lights up against the near-perfect background like a single off-key voice in a hundred-voice chorus. The tiny error rate is not the exception to the system’s fidelity. It is the visible proof that the error-detection is running.</w:t>
+        <w:t xml:space="preserve">agrees; the Atharvaveda’s corruptions are recoverable exactly to the degree that two independent witnesses can be cross-checked. In a low-redundancy system, an error simply becomes the new text, silently. In a system this thoroughly cross-checked, an error cannot hide, it lights up against the near-perfect background like a single off-key voice in a hundred-voice chorus. The tiny error rate is not the exception to the system’s fidelity but the visible proof that the error-detection is running.</w:t>
       </w:r>
     </w:p>
     <w:p>
@@ -5364,7 +5364,7 @@
         <w:pStyle w:val="BodyText"/>
       </w:pPr>
       <w:r>
-        <w:t xml:space="preserve">They worked from multiple independent manuscript traditions, geographically separated. Some came from Babylon, some from Palestine, some from other Jewish communities scattered across the Mediterranean and Near East. This geographic separation is the crucial feature. Each tradition had been copied independently for centuries. They had accumulated different errors, different scribal slips, different marginal glosses that had crept into the main text, different orthographic conventions. But because the copying errors were independent, because no single scribe or scribal school could have coordinated changes across all the traditions simultaneously, the points where the traditions agreed were almost certainly original, and the points where they diverged were almost certainly corrupted in at least one lineage.</w:t>
+        <w:t xml:space="preserve">They worked from multiple independent manuscript traditions, geographically separated. Some came from Babylon, some from Palestine, some from other Jewish communities scattered across the Mediterranean and Near East. This geographic separation is the decisive feature. Each tradition had been copied independently for centuries. They had accumulated different errors, different scribal slips, different marginal glosses that had crept into the main text, different orthographic conventions. But because the copying errors were independent, because no single scribe or scribal school could have coordinated changes across all the traditions simultaneously, the points where the traditions agreed were almost certainly original, and the points where they diverged were almost certainly corrupted in at least one lineage.</w:t>
       </w:r>
     </w:p>
     <w:p>
@@ -5432,7 +5432,7 @@
         <w:pStyle w:val="BodyText"/>
       </w:pPr>
       <w:r>
-        <w:t xml:space="preserve">And crucially, their scholarly disagreement was productive. When traditions diverged, the divergence wasn’t suppressed. It was examined, debated, sometimes resolved, sometimes preserved as a noted variant in the margin, the</w:t>
+        <w:t xml:space="preserve">And their scholarly disagreement was productive, which mattered as much as their agreement. When traditions diverged, the divergence wasn’t suppressed. It was examined, debated, sometimes resolved, sometimes preserved as a noted variant in the margin, the</w:t>
       </w:r>
       <w:r>
         <w:t xml:space="preserve"> </w:t>
@@ -5480,7 +5480,23 @@
         <w:t xml:space="preserve"> </w:t>
       </w:r>
       <w:r>
-        <w:t xml:space="preserve">The argument was the error-detection mechanism. A community of scholars who agree on everything is useless for catching errors. A community that disagrees, rigorously and transparently, catches everything. The disagreement isn’t a failure of the system. It IS the system.</w:t>
+        <w:t xml:space="preserve">The argument was the error-detection mechanism. A community of scholars who agree on everything is useless for catching errors. A community that disagrees, rigorously and transparently, catches everything. The disagreement isn’t a failure of the system; it</w:t>
+      </w:r>
+      <w:r>
+        <w:t xml:space="preserve"> </w:t>
+      </w:r>
+      <w:r>
+        <w:rPr>
+          <w:i/>
+          <w:iCs/>
+        </w:rPr>
+        <w:t xml:space="preserve">is</w:t>
+      </w:r>
+      <w:r>
+        <w:t xml:space="preserve"> </w:t>
+      </w:r>
+      <w:r>
+        <w:t xml:space="preserve">the system.</w:t>
       </w:r>
     </w:p>
     <w:p>
@@ -5924,7 +5940,7 @@
         <w:pStyle w:val="BodyText"/>
       </w:pPr>
       <w:r>
-        <w:t xml:space="preserve">The subset of people who introduced the corruption deliberately, rather than inheriting it passively, have a sharper problem. They know the narrative is constructed because they constructed it. Their resistance to correction isn’t tribal inertia. It’s self-preservation. If the error-correction mechanism works, it traces the error back to its source. The provenance chain leads to them. So they fight the provenance chain.</w:t>
+        <w:t xml:space="preserve">The subset of people who introduced the corruption deliberately, rather than inheriting it passively, have a sharper problem. They know the narrative is constructed because they constructed it. Their resistance to correction isn’t tribal inertia; it’s self-preservation. If the error-correction mechanism works, it traces the error back to its source. The provenance chain leads to them. So they fight the provenance chain.</w:t>
       </w:r>
     </w:p>
     <w:p>
@@ -6120,15 +6136,15 @@
         <w:t xml:space="preserve"> </w:t>
       </w:r>
       <w:r>
-        <w:t xml:space="preserve">become God’s garden in Eden. The narrative structures are too parallel to be coincidental, and the moral inversions too systematic to be accidental. This isn’t copying. It’s deliberate recasting, motif by motif, character by character, moral valence by moral valence, to produce a counter-narrative that refutes the original by using its own symbolic vocabulary against it.</w:t>
-      </w:r>
-    </w:p>
-    <w:p>
-      <w:pPr>
-        <w:pStyle w:val="BodyText"/>
-      </w:pPr>
-      <w:r>
-        <w:t xml:space="preserve">You can see this across ancient religious texts wherever traditions came into sustained contact. The same figures, the same images, the same narrative patterns appear in multiple traditions, but the moral valences are reversed. What is holy in one system is profane in another. What is wisdom in one is deception in another. This isn’t coincidence or convergent evolution. It’s deliberate symbolic warfare: the attempt to corrupt the other tradition’s encoding by hijacking its symbols and reversing their polarity.</w:t>
+        <w:t xml:space="preserve">become God’s garden in Eden. The narrative structures are too parallel to be coincidental, and the moral inversions too systematic to be accidental. This isn’t copying but deliberate recasting, motif by motif, character by character, moral valence by moral valence, to produce a counter-narrative that refutes the original by using its own symbolic vocabulary against it.</w:t>
+      </w:r>
+    </w:p>
+    <w:p>
+      <w:pPr>
+        <w:pStyle w:val="BodyText"/>
+      </w:pPr>
+      <w:r>
+        <w:t xml:space="preserve">You can see this across ancient religious texts wherever traditions came into sustained contact. The same figures, the same images, the same narrative patterns appear in multiple traditions, but the moral valences are reversed. What is holy in one system is profane in another. What is wisdom in one is deception in another. This isn’t coincidence or convergent evolution but deliberate symbolic warfare: the attempt to corrupt the other tradition’s encoding by hijacking its symbols and reversing their polarity.</w:t>
       </w:r>
     </w:p>
     <w:p>
@@ -6289,7 +6305,7 @@
         <w:t xml:space="preserve"> </w:t>
       </w:r>
       <w:r>
-        <w:t xml:space="preserve">Standard intelligence tests: normal. Logical analysis: intact. Practical life: catastrophic. They made bad financial decisions, bad social decisions, bad professional decisions, consistently and without being able to explain why. Damasio’s finding was that they had lost what he called somatic markers, the bodily signals that pre-filter options under consideration, flagging some as dangerous and some as promising before conscious reasoning even begins. They weren’t more rational for having lost the signal. They were less capable of navigating the world. The emotional channel was load-bearing. Remove it and the decision-making system doesn’t improve; it degrades, even as the abstract reasoning remains technically functional.</w:t>
+        <w:t xml:space="preserve">Standard intelligence tests: normal. Logical analysis: intact. Practical life: catastrophic. They made bad financial decisions, bad social decisions, bad professional decisions, consistently and without being able to explain why. Damasio’s finding was that they had lost what he called somatic markers, the bodily signals that pre-filter options under consideration, flagging some as dangerous and some as promising before conscious reasoning even begins. They weren’t more rational for having lost the signal; they were less capable of living in the world. The emotional channel was load-bearing. Remove it and the decision-making system doesn’t improve; it degrades, even as the abstract reasoning remains technically functional.</w:t>
       </w:r>
     </w:p>
     <w:p>
@@ -6385,7 +6401,7 @@
         <w:pStyle w:val="BodyText"/>
       </w:pPr>
       <w:r>
-        <w:t xml:space="preserve">This is why wisdom accrues with age in a way that raw intelligence doesn’t. Intelligence is largely fixed by neurology. Wisdom requires a dataset, years of emotional responses checked against outcomes, of excitement followed into error, of resistance examined and found to be projection rather than insight. The Kabbalistic forty-year minimum isn’t mysticism. It is a dataset size requirement.</w:t>
+        <w:t xml:space="preserve">This is why wisdom accrues with age in a way that raw intelligence doesn’t. Intelligence is largely fixed by neurology. Wisdom requires a dataset, years of emotional responses checked against outcomes, of excitement followed into error, of resistance examined and found to be projection rather than insight. The Kabbalistic forty-year minimum isn’t mysticism; it is a dataset-size requirement.</w:t>
       </w:r>
     </w:p>
     <w:p>
@@ -6704,7 +6720,7 @@
         <w:pStyle w:val="BodyText"/>
       </w:pPr>
       <w:r>
-        <w:t xml:space="preserve">And that last phrase is not loose talk. It is how perception actually works. A great deal of what we experience as simply</w:t>
+        <w:t xml:space="preserve">And that last phrase is not loose talk; it is how perception actually works. A great deal of what we experience as simply</w:t>
       </w:r>
       <w:r>
         <w:t xml:space="preserve"> </w:t>
@@ -7797,7 +7813,7 @@
         <w:t xml:space="preserve">deterministic computation and environmental delegation</w:t>
       </w:r>
       <w:r>
-        <w:t xml:space="preserve">. A conventional virtual machine that executes precise operations. Stop blocks, jigs, and machines that embody operations in physical structure. Artifacts that encode knowledge in material form. You don’t ask the brain to do long division, you hand it to the calculator. You don’t ask the brain to measure each board, you push it against the block. You don’t ask a probabilistic network to run a primality test; you let the CPU do it. This layer eliminates an entire class of error by refusing to use probabilistic systems for deterministic tasks. It’s not glamorous. It’s foundational. Everything above it depends on the certainty it provides.</w:t>
+        <w:t xml:space="preserve">. A conventional virtual machine that executes precise operations. Stop blocks, jigs, and machines that embody operations in physical structure. Artifacts that encode knowledge in material form. You don’t ask the brain to do long division, you hand it to the calculator. You don’t ask the brain to measure each board, you push it against the block. You don’t ask a probabilistic network to run a primality test; you let the CPU do it. This layer eliminates an entire class of error by refusing to use probabilistic systems for deterministic tasks. It isn’t glamorous; it’s foundational. Everything above it depends on the certainty it provides.</w:t>
       </w:r>
     </w:p>
     <w:p>
@@ -8013,7 +8029,7 @@
         <w:pStyle w:val="FirstParagraph"/>
       </w:pPr>
       <w:r>
-        <w:t xml:space="preserve">This architecture isn’t novel. It’s ancient.</w:t>
+        <w:t xml:space="preserve">This architecture isn’t novel; it’s ancient.</w:t>
       </w:r>
     </w:p>
     <w:p>
@@ -8098,7 +8114,7 @@
         <w:pStyle w:val="FirstParagraph"/>
       </w:pPr>
       <w:r>
-        <w:t xml:space="preserve">Current AI research is building one layer of this stack and trying to scale it until it substitutes for the other six. More parameters. More training data. Longer context windows. The Vedic Brahmins didn’t scale their brains, they built an architecture around them, one so robust it maintained perfect fidelity for three thousand years. The Masoretes didn’t try to remember harder, they built systems that caught them when they forgot. The</w:t>
+        <w:t xml:space="preserve">Current AI research is building one layer of this stack and trying to scale it until it substitutes for the other six. More parameters. More training data. Longer context windows. The Vedic Brahmins didn’t scale their brains, they built an architecture around them, one so durable it maintained perfect fidelity for three thousand years. The Masoretes didn’t try to remember harder, they built systems that caught them when they forgot. The</w:t>
       </w:r>
       <w:r>
         <w:t xml:space="preserve"> </w:t>
@@ -8545,7 +8561,7 @@
         <w:t xml:space="preserve"> </w:t>
       </w:r>
       <w:r>
-        <w:t xml:space="preserve">Its backbone is Ionic, but woven through it are Aeolic forms, Arcado-Cypriot forms, and, this is the crucial layer, survivals from Mycenaean Greek, the language of the Bronze Age palaces that had collapsed four or five centuries before the poems were written down. The poets kept the old forms not out of antiquarianism but because they were metrically useful: an archaic form and its modern equivalent often had different syllable-lengths, so a bard building a line in strict hexameter reached for whichever one fit. The meter selected for archaism. The old words survived because they were load-bearing.</w:t>
+        <w:t xml:space="preserve">Its backbone is Ionic, but woven through it are Aeolic forms, Arcado-Cypriot forms, and, this is the layer that matters most, survivals from Mycenaean Greek, the language of the Bronze Age palaces that had collapsed four or five centuries before the poems were written down. The poets kept the old forms not out of antiquarianism but because they were metrically useful: an archaic form and its modern equivalent often had different syllable-lengths, so a bard building a line in strict hexameter reached for whichever one fit. The meter selected for archaism. The old words survived because they were load-bearing.</w:t>
       </w:r>
     </w:p>
     <w:p>

</xml_diff>